<commit_message>
remove emergency service copy
</commit_message>
<xml_diff>
--- a/website-content-for-marcia.docx
+++ b/website-content-for-marcia.docx
@@ -768,7 +768,7 @@
           <w:spacing w:val="0"/>
           <w:color w:val="1A1A1A"/>
         </w:rPr>
-        <w:t xml:space="preserve">Our New Jersey truck and tire service center provides repair and service seven days a week. Emergency phone: 877-99-SOMET.</w:t>
+        <w:t xml:space="preserve">Our New Jersey truck and tire service center provides repair and service throughout the week.</w:t>
       </w:r>
     </w:p>
     <w:p>
@@ -2508,168 +2508,53 @@
           <w:spacing w:val="0"/>
           <w:color w:val="21336C"/>
         </w:rPr>
-        <w:t xml:space="preserve">Road Service / Emergency</w:t>
-      </w:r>
-    </w:p>
-    <w:p>
-      <w:pPr>
-        <w:spacing w:after="266"/>
-      </w:pPr>
-      <w:r>
-        <w:rPr>
-          <w:rFonts w:ascii="Helvetica" w:hAnsi="Helvetica" w:cs="Helvetica"/>
-          <w:sz w:val="32"/>
-          <w:sz-cs w:val="32"/>
-          <w:spacing w:val="0"/>
-          <w:color w:val="1A1A1A"/>
-        </w:rPr>
-        <w:t xml:space="preserve">Current draft: When you're stuck, call our emergency hotline. We'll get you back on the road as quickly as possible.</w:t>
-      </w:r>
-    </w:p>
-    <w:p>
-      <w:pPr>
-        <w:spacing w:after="266"/>
-      </w:pPr>
-      <w:r>
-        <w:rPr>
-          <w:rFonts w:ascii="Helvetica" w:hAnsi="Helvetica" w:cs="Helvetica"/>
-          <w:sz w:val="32"/>
-          <w:sz-cs w:val="32"/>
-          <w:spacing w:val="0"/>
-          <w:color w:val="1A1A1A"/>
-        </w:rPr>
-        <w:t xml:space="preserve">Current references on the website:</w:t>
-      </w:r>
-    </w:p>
-    <w:p>
-      <w:pPr>
-        <w:ind w:left="720" w:first-line="-720"/>
-        <w:spacing w:after="106"/>
-      </w:pPr>
-      <w:r>
-        <w:rPr>
-          <w:rFonts w:ascii="Helvetica" w:hAnsi="Helvetica" w:cs="Helvetica"/>
-          <w:sz w:val="32"/>
-          <w:sz-cs w:val="32"/>
-          <w:color w:val="1A1A1A"/>
-        </w:rPr>
-        <w:t xml:space="preserve"/>
-        <w:tab/>
-        <w:t xml:space="preserve">•</w:t>
-        <w:tab/>
-        <w:t xml:space="preserve"/>
-      </w:r>
-      <w:r>
-        <w:rPr>
-          <w:rFonts w:ascii="Helvetica" w:hAnsi="Helvetica" w:cs="Helvetica"/>
-          <w:sz w:val="32"/>
-          <w:sz-cs w:val="32"/>
-          <w:spacing w:val="0"/>
-          <w:color w:val="1A1A1A"/>
-        </w:rPr>
-        <w:t xml:space="preserve">service available 7 days a week</w:t>
-      </w:r>
-    </w:p>
-    <w:p>
-      <w:pPr>
-        <w:ind w:left="720" w:first-line="-720"/>
-        <w:spacing w:after="106"/>
-      </w:pPr>
-      <w:r>
-        <w:rPr>
-          <w:rFonts w:ascii="Helvetica" w:hAnsi="Helvetica" w:cs="Helvetica"/>
-          <w:sz w:val="32"/>
-          <w:sz-cs w:val="32"/>
-          <w:color w:val="1A1A1A"/>
-        </w:rPr>
-        <w:t xml:space="preserve"/>
-        <w:tab/>
-        <w:t xml:space="preserve">•</w:t>
-        <w:tab/>
-        <w:t xml:space="preserve"/>
-      </w:r>
-      <w:r>
-        <w:rPr>
-          <w:rFonts w:ascii="Helvetica" w:hAnsi="Helvetica" w:cs="Helvetica"/>
-          <w:sz w:val="32"/>
-          <w:sz-cs w:val="32"/>
-          <w:spacing w:val="0"/>
-          <w:color w:val="1A1A1A"/>
-        </w:rPr>
-        <w:t xml:space="preserve">emergency number: 877-99-SOMET</w:t>
-      </w:r>
-    </w:p>
-    <w:p>
-      <w:pPr>
-        <w:spacing w:after="266"/>
-      </w:pPr>
-      <w:r>
-        <w:rPr>
-          <w:rFonts w:ascii="Helvetica" w:hAnsi="Helvetica" w:cs="Helvetica"/>
-          <w:sz w:val="32"/>
-          <w:sz-cs w:val="32"/>
-          <w:spacing w:val="0"/>
-          <w:color w:val="1A1A1A"/>
-        </w:rPr>
-        <w:t xml:space="preserve">Please confirm:</w:t>
-      </w:r>
-    </w:p>
-    <w:p>
-      <w:pPr>
-        <w:ind w:left="720" w:first-line="-720"/>
-        <w:spacing w:after="106"/>
-      </w:pPr>
-      <w:r>
-        <w:rPr>
-          <w:rFonts w:ascii="Helvetica" w:hAnsi="Helvetica" w:cs="Helvetica"/>
-          <w:sz w:val="32"/>
-          <w:sz-cs w:val="32"/>
-          <w:color w:val="1A1A1A"/>
-        </w:rPr>
-        <w:t xml:space="preserve"/>
-        <w:tab/>
-        <w:t xml:space="preserve">•</w:t>
-        <w:tab/>
-        <w:t xml:space="preserve"/>
-      </w:r>
-      <w:r>
-        <w:rPr>
-          <w:rFonts w:ascii="Helvetica" w:hAnsi="Helvetica" w:cs="Helvetica"/>
-          <w:sz w:val="32"/>
-          <w:sz-cs w:val="32"/>
-          <w:spacing w:val="0"/>
-          <w:color w:val="1A1A1A"/>
-        </w:rPr>
-        <w:t xml:space="preserve">whether road service / emergency service should be highlighted</w:t>
-      </w:r>
-    </w:p>
-    <w:p>
-      <w:pPr>
-        <w:ind w:left="720" w:first-line="-720"/>
-        <w:spacing w:after="106"/>
-      </w:pPr>
-      <w:r>
-        <w:rPr>
-          <w:rFonts w:ascii="Helvetica" w:hAnsi="Helvetica" w:cs="Helvetica"/>
-          <w:sz w:val="32"/>
-          <w:sz-cs w:val="32"/>
-          <w:color w:val="1A1A1A"/>
-        </w:rPr>
-        <w:t xml:space="preserve"/>
-        <w:tab/>
-        <w:t xml:space="preserve">•</w:t>
-        <w:tab/>
-        <w:t xml:space="preserve"/>
-      </w:r>
-      <w:r>
-        <w:rPr>
-          <w:rFonts w:ascii="Helvetica" w:hAnsi="Helvetica" w:cs="Helvetica"/>
-          <w:sz w:val="32"/>
-          <w:sz-cs w:val="32"/>
-          <w:spacing w:val="0"/>
-          <w:color w:val="1A1A1A"/>
-        </w:rPr>
-        <w:t xml:space="preserve">the exact hours and details you want listed</w:t>
+        <w:t xml:space="preserve">Driver Amenities</w:t>
+      </w:r>
+    </w:p>
+    <w:p>
+      <w:pPr>
+        <w:spacing w:after="266"/>
+      </w:pPr>
+      <w:r>
+        <w:rPr>
+          <w:rFonts w:ascii="Helvetica" w:hAnsi="Helvetica" w:cs="Helvetica"/>
+          <w:sz w:val="32"/>
+          <w:sz-cs w:val="32"/>
+          <w:spacing w:val="0"/>
+          <w:color w:val="1A1A1A"/>
+        </w:rPr>
+        <w:t xml:space="preserve">Current draft: Relax in our comfortable driver's lounge while your truck is being serviced. Hot coffee, refreshments, TV, and internet available.</w:t>
+      </w:r>
+    </w:p>
+    <w:p>
+      <w:pPr>
+        <w:spacing w:after="266"/>
+      </w:pPr>
+      <w:r>
+        <w:rPr>
+          <w:rFonts w:ascii="Helvetica" w:hAnsi="Helvetica" w:cs="Helvetica"/>
+          <w:sz w:val="32"/>
+          <w:sz-cs w:val="32"/>
+          <w:spacing w:val="0"/>
+          <w:color w:val="1A1A1A"/>
+        </w:rPr>
+        <w:t xml:space="preserve">Please confirm if this should remain on the site.</w:t>
+      </w:r>
+    </w:p>
+    <w:p>
+      <w:pPr>
+        <w:spacing w:after="213"/>
+      </w:pPr>
+      <w:r>
+        <w:rPr>
+          <w:rFonts w:ascii="Helvetica" w:hAnsi="Helvetica" w:cs="Helvetica"/>
+          <w:sz w:val="42"/>
+          <w:sz-cs w:val="42"/>
+          <w:b/>
+          <w:spacing w:val="0"/>
+          <w:color w:val="16214C"/>
+        </w:rPr>
+        <w:t xml:space="preserve">Contact Information</w:t>
       </w:r>
     </w:p>
     <w:p>
@@ -2685,53 +2570,22 @@
           <w:spacing w:val="0"/>
           <w:color w:val="21336C"/>
         </w:rPr>
-        <w:t xml:space="preserve">Driver Amenities</w:t>
-      </w:r>
-    </w:p>
-    <w:p>
-      <w:pPr>
-        <w:spacing w:after="266"/>
-      </w:pPr>
-      <w:r>
-        <w:rPr>
-          <w:rFonts w:ascii="Helvetica" w:hAnsi="Helvetica" w:cs="Helvetica"/>
-          <w:sz w:val="32"/>
-          <w:sz-cs w:val="32"/>
-          <w:spacing w:val="0"/>
-          <w:color w:val="1A1A1A"/>
-        </w:rPr>
-        <w:t xml:space="preserve">Current draft: Relax in our comfortable driver's lounge while your truck is being serviced. Hot coffee, refreshments, TV, and internet available.</w:t>
-      </w:r>
-    </w:p>
-    <w:p>
-      <w:pPr>
-        <w:spacing w:after="266"/>
-      </w:pPr>
-      <w:r>
-        <w:rPr>
-          <w:rFonts w:ascii="Helvetica" w:hAnsi="Helvetica" w:cs="Helvetica"/>
-          <w:sz w:val="32"/>
-          <w:sz-cs w:val="32"/>
-          <w:spacing w:val="0"/>
-          <w:color w:val="1A1A1A"/>
-        </w:rPr>
-        <w:t xml:space="preserve">Please confirm if this should remain on the site.</w:t>
-      </w:r>
-    </w:p>
-    <w:p>
-      <w:pPr>
-        <w:spacing w:after="213"/>
-      </w:pPr>
-      <w:r>
-        <w:rPr>
-          <w:rFonts w:ascii="Helvetica" w:hAnsi="Helvetica" w:cs="Helvetica"/>
-          <w:sz w:val="42"/>
-          <w:sz-cs w:val="42"/>
-          <w:b/>
-          <w:spacing w:val="0"/>
-          <w:color w:val="16214C"/>
-        </w:rPr>
-        <w:t xml:space="preserve">Contact Information</w:t>
+        <w:t xml:space="preserve">Address</w:t>
+      </w:r>
+    </w:p>
+    <w:p>
+      <w:pPr>
+        <w:spacing w:after="266"/>
+      </w:pPr>
+      <w:r>
+        <w:rPr>
+          <w:rFonts w:ascii="Helvetica" w:hAnsi="Helvetica" w:cs="Helvetica"/>
+          <w:sz w:val="32"/>
+          <w:sz-cs w:val="32"/>
+          <w:spacing w:val="0"/>
+          <w:color w:val="1A1A1A"/>
+        </w:rPr>
+        <w:t xml:space="preserve">860 North Avenue East Elizabeth, NJ 07201</w:t>
       </w:r>
     </w:p>
     <w:p>
@@ -2747,22 +2601,37 @@
           <w:spacing w:val="0"/>
           <w:color w:val="21336C"/>
         </w:rPr>
-        <w:t xml:space="preserve">Address</w:t>
-      </w:r>
-    </w:p>
-    <w:p>
-      <w:pPr>
-        <w:spacing w:after="266"/>
-      </w:pPr>
-      <w:r>
-        <w:rPr>
-          <w:rFonts w:ascii="Helvetica" w:hAnsi="Helvetica" w:cs="Helvetica"/>
-          <w:sz w:val="32"/>
-          <w:sz-cs w:val="32"/>
-          <w:spacing w:val="0"/>
-          <w:color w:val="1A1A1A"/>
-        </w:rPr>
-        <w:t xml:space="preserve">860 North Avenue East Elizabeth, NJ 07201</w:t>
+        <w:t xml:space="preserve">Hours</w:t>
+      </w:r>
+    </w:p>
+    <w:p>
+      <w:pPr>
+        <w:spacing w:after="266"/>
+      </w:pPr>
+      <w:r>
+        <w:rPr>
+          <w:rFonts w:ascii="Helvetica" w:hAnsi="Helvetica" w:cs="Helvetica"/>
+          <w:sz w:val="32"/>
+          <w:sz-cs w:val="32"/>
+          <w:spacing w:val="0"/>
+          <w:color w:val="1A1A1A"/>
+        </w:rPr>
+        <w:t xml:space="preserve">Mon - Fri: 7:00 AM - 11:00 PM Saturday: 8:00 AM - 6:00 PM</w:t>
+      </w:r>
+    </w:p>
+    <w:p>
+      <w:pPr>
+        <w:spacing w:after="266"/>
+      </w:pPr>
+      <w:r>
+        <w:rPr>
+          <w:rFonts w:ascii="Helvetica" w:hAnsi="Helvetica" w:cs="Helvetica"/>
+          <w:sz w:val="32"/>
+          <w:sz-cs w:val="32"/>
+          <w:spacing w:val="0"/>
+          <w:color w:val="1A1A1A"/>
+        </w:rPr>
+        <w:t xml:space="preserve">Please confirm whether these hours are still correct.</w:t>
       </w:r>
     </w:p>
     <w:p>
@@ -2778,52 +2647,6 @@
           <w:spacing w:val="0"/>
           <w:color w:val="21336C"/>
         </w:rPr>
-        <w:t xml:space="preserve">Hours</w:t>
-      </w:r>
-    </w:p>
-    <w:p>
-      <w:pPr>
-        <w:spacing w:after="266"/>
-      </w:pPr>
-      <w:r>
-        <w:rPr>
-          <w:rFonts w:ascii="Helvetica" w:hAnsi="Helvetica" w:cs="Helvetica"/>
-          <w:sz w:val="32"/>
-          <w:sz-cs w:val="32"/>
-          <w:spacing w:val="0"/>
-          <w:color w:val="1A1A1A"/>
-        </w:rPr>
-        <w:t xml:space="preserve">Mon - Fri: 7:00 AM - 11:00 PM Saturday: 8:00 AM - 6:00 PM</w:t>
-      </w:r>
-    </w:p>
-    <w:p>
-      <w:pPr>
-        <w:spacing w:after="266"/>
-      </w:pPr>
-      <w:r>
-        <w:rPr>
-          <w:rFonts w:ascii="Helvetica" w:hAnsi="Helvetica" w:cs="Helvetica"/>
-          <w:sz w:val="32"/>
-          <w:sz-cs w:val="32"/>
-          <w:spacing w:val="0"/>
-          <w:color w:val="1A1A1A"/>
-        </w:rPr>
-        <w:t xml:space="preserve">Please confirm whether these hours are still correct.</w:t>
-      </w:r>
-    </w:p>
-    <w:p>
-      <w:pPr>
-        <w:spacing w:after="160"/>
-      </w:pPr>
-      <w:r>
-        <w:rPr>
-          <w:rFonts w:ascii="Helvetica" w:hAnsi="Helvetica" w:cs="Helvetica"/>
-          <w:sz w:val="34"/>
-          <w:sz-cs w:val="34"/>
-          <w:b/>
-          <w:spacing w:val="0"/>
-          <w:color w:val="21336C"/>
-        </w:rPr>
         <w:t xml:space="preserve">Phone Numbers</w:t>
       </w:r>
     </w:p>
@@ -2854,35 +2677,6 @@
           <w:color w:val="1A1A1A"/>
         </w:rPr>
         <w:t xml:space="preserve">Office: 908-943-9000</w:t>
-      </w:r>
-    </w:p>
-    <w:p>
-      <w:pPr>
-        <w:ind w:left="720" w:first-line="-720"/>
-        <w:spacing w:after="106"/>
-      </w:pPr>
-      <w:r>
-        <w:rPr>
-          <w:rFonts w:ascii="Helvetica" w:hAnsi="Helvetica" w:cs="Helvetica"/>
-          <w:sz w:val="32"/>
-          <w:sz-cs w:val="32"/>
-          <w:color w:val="1A1A1A"/>
-        </w:rPr>
-        <w:t xml:space="preserve"/>
-        <w:tab/>
-        <w:t xml:space="preserve">•</w:t>
-        <w:tab/>
-        <w:t xml:space="preserve"/>
-      </w:r>
-      <w:r>
-        <w:rPr>
-          <w:rFonts w:ascii="Helvetica" w:hAnsi="Helvetica" w:cs="Helvetica"/>
-          <w:sz w:val="32"/>
-          <w:sz-cs w:val="32"/>
-          <w:spacing w:val="0"/>
-          <w:color w:val="1A1A1A"/>
-        </w:rPr>
-        <w:t xml:space="preserve">Emergency: 877-99-SOMET</w:t>
       </w:r>
     </w:p>
     <w:p>

</xml_diff>